<commit_message>
Added AI usage for PostgreSQL connection
</commit_message>
<xml_diff>
--- a/docs/ai-usage-register.docx
+++ b/docs/ai-usage-register.docx
@@ -6,69 +6,73 @@
       <w:pPr>
         <w:pStyle w:val="Heading1"/>
         <w:rPr>
-          <w:rFonts w:ascii="Times New Roman" w:hAnsi="Times New Roman" w:cs="Times New Roman"/>
+          <w:rFonts w:ascii="Times New Roman" w:eastAsiaTheme="minorEastAsia" w:hAnsi="Times New Roman" w:cs="Times New Roman"/>
+          <w:sz w:val="24"/>
+          <w:szCs w:val="24"/>
         </w:rPr>
       </w:pPr>
+      <w:bookmarkStart w:id="0" w:name="_Toc240403864"/>
       <w:r>
         <w:rPr>
           <w:rFonts w:ascii="Times New Roman" w:hAnsi="Times New Roman" w:cs="Times New Roman"/>
         </w:rPr>
         <w:t>AI Usage Register</w:t>
       </w:r>
+      <w:bookmarkEnd w:id="0"/>
     </w:p>
     <w:p>
       <w:pPr>
+        <w:spacing w:line="276" w:lineRule="auto"/>
         <w:rPr>
           <w:rFonts w:ascii="Times New Roman" w:hAnsi="Times New Roman" w:cs="Times New Roman"/>
+        </w:rPr>
+      </w:pPr>
+      <w:r>
+        <w:rPr>
+          <w:rFonts w:ascii="Times New Roman" w:eastAsia="Times New Roman" w:hAnsi="Times New Roman" w:cs="Times New Roman"/>
+          <w:sz w:val="22"/>
+          <w:szCs w:val="22"/>
+        </w:rPr>
+        <w:t>In the event if any team member has asked the assistance of AI to analyse, research, compare architecture, design, code, test, debug, review documentation and operational analysis, the following table underneath provide all the information that each AI usage must require. The following key points of the table will assist in completing each AI usage within the table:</w:t>
+      </w:r>
+    </w:p>
+    <w:p>
+      <w:pPr>
+        <w:pStyle w:val="Heading2"/>
+        <w:rPr>
+          <w:rFonts w:ascii="Times New Roman" w:eastAsia="Times New Roman" w:hAnsi="Times New Roman" w:cs="Times New Roman"/>
+        </w:rPr>
+      </w:pPr>
+      <w:bookmarkStart w:id="1" w:name="_Toc240403865"/>
+      <w:r>
+        <w:rPr>
+          <w:rFonts w:ascii="Times New Roman" w:eastAsia="Times New Roman" w:hAnsi="Times New Roman" w:cs="Times New Roman"/>
+        </w:rPr>
+        <w:t>Features</w:t>
+      </w:r>
+      <w:bookmarkEnd w:id="1"/>
+    </w:p>
+    <w:p>
+      <w:pPr>
+        <w:pStyle w:val="ListParagraph"/>
+        <w:numPr>
+          <w:ilvl w:val="0"/>
+          <w:numId w:val="3"/>
+        </w:numPr>
+        <w:spacing w:after="0" w:line="276" w:lineRule="auto"/>
+        <w:rPr>
+          <w:rFonts w:ascii="Times New Roman" w:eastAsia="Times New Roman" w:hAnsi="Times New Roman" w:cs="Times New Roman"/>
           <w:sz w:val="22"/>
           <w:szCs w:val="22"/>
         </w:rPr>
       </w:pPr>
       <w:r>
         <w:rPr>
-          <w:rFonts w:ascii="Times New Roman" w:hAnsi="Times New Roman" w:cs="Times New Roman"/>
+          <w:rFonts w:ascii="Times New Roman" w:eastAsia="Times New Roman" w:hAnsi="Times New Roman" w:cs="Times New Roman"/>
           <w:sz w:val="22"/>
           <w:szCs w:val="22"/>
         </w:rPr>
-        <w:t xml:space="preserve">In the event if any team member has asked the assistance of AI to analyse, research, </w:t>
-      </w:r>
-      <w:r>
-        <w:rPr>
-          <w:rFonts w:ascii="Times New Roman" w:hAnsi="Times New Roman" w:cs="Times New Roman"/>
-          <w:sz w:val="22"/>
-          <w:szCs w:val="22"/>
-        </w:rPr>
-        <w:t>compare architecture, design, code, test, debug, review documentation</w:t>
-      </w:r>
-      <w:r>
-        <w:rPr>
-          <w:rFonts w:ascii="Times New Roman" w:hAnsi="Times New Roman" w:cs="Times New Roman"/>
-          <w:sz w:val="22"/>
-          <w:szCs w:val="22"/>
-        </w:rPr>
-        <w:t xml:space="preserve"> and operational analysis, the following table underneath provide all the information that each AI usage must require.</w:t>
-      </w:r>
-      <w:r>
-        <w:rPr>
-          <w:rFonts w:ascii="Times New Roman" w:hAnsi="Times New Roman" w:cs="Times New Roman"/>
-          <w:sz w:val="22"/>
-          <w:szCs w:val="22"/>
-        </w:rPr>
-        <w:t xml:space="preserve"> The following key points of the table will assist in completing each AI usage within the table:</w:t>
-      </w:r>
-    </w:p>
-    <w:p>
-      <w:pPr>
-        <w:pStyle w:val="Heading2"/>
-        <w:rPr>
-          <w:rFonts w:ascii="Times New Roman" w:hAnsi="Times New Roman" w:cs="Times New Roman"/>
-        </w:rPr>
-      </w:pPr>
-      <w:r>
-        <w:rPr>
-          <w:rFonts w:ascii="Times New Roman" w:hAnsi="Times New Roman" w:cs="Times New Roman"/>
-        </w:rPr>
-        <w:t>Features</w:t>
+        <w:t>ID: This is the ID of an AI usage. The naming convention of AI IDs are “AI-001”.</w:t>
       </w:r>
     </w:p>
     <w:p>
@@ -76,414 +80,18 @@
         <w:pStyle w:val="ListParagraph"/>
         <w:numPr>
           <w:ilvl w:val="0"/>
-          <w:numId w:val="1"/>
+          <w:numId w:val="3"/>
         </w:numPr>
+        <w:spacing w:after="0" w:line="276" w:lineRule="auto"/>
         <w:rPr>
-          <w:rFonts w:ascii="Times New Roman" w:hAnsi="Times New Roman" w:cs="Times New Roman"/>
+          <w:rFonts w:ascii="Times New Roman" w:eastAsia="Times New Roman" w:hAnsi="Times New Roman" w:cs="Times New Roman"/>
           <w:sz w:val="22"/>
           <w:szCs w:val="22"/>
         </w:rPr>
       </w:pPr>
       <w:r>
         <w:rPr>
-          <w:rFonts w:ascii="Times New Roman" w:hAnsi="Times New Roman" w:cs="Times New Roman"/>
-          <w:sz w:val="22"/>
-          <w:szCs w:val="22"/>
-        </w:rPr>
-        <w:t xml:space="preserve">ID: This is the ID of an AI usage. </w:t>
-      </w:r>
-      <w:r>
-        <w:rPr>
-          <w:rFonts w:ascii="Times New Roman" w:hAnsi="Times New Roman" w:cs="Times New Roman"/>
-          <w:sz w:val="22"/>
-          <w:szCs w:val="22"/>
-        </w:rPr>
-        <w:t>The following will give the naming convention of AI IDs:</w:t>
-      </w:r>
-    </w:p>
-    <w:p>
-      <w:pPr>
-        <w:pStyle w:val="ListParagraph"/>
-        <w:numPr>
-          <w:ilvl w:val="1"/>
-          <w:numId w:val="1"/>
-        </w:numPr>
-        <w:rPr>
-          <w:rFonts w:ascii="Times New Roman" w:hAnsi="Times New Roman" w:cs="Times New Roman"/>
-          <w:sz w:val="22"/>
-          <w:szCs w:val="22"/>
-        </w:rPr>
-      </w:pPr>
-      <w:r>
-        <w:rPr>
-          <w:rFonts w:ascii="Times New Roman" w:hAnsi="Times New Roman" w:cs="Times New Roman"/>
-          <w:sz w:val="22"/>
-          <w:szCs w:val="22"/>
-        </w:rPr>
-        <w:t>Research:  E.g. “AI-RES-1</w:t>
-      </w:r>
-      <w:r>
-        <w:rPr>
-          <w:rFonts w:ascii="Times New Roman" w:hAnsi="Times New Roman" w:cs="Times New Roman"/>
-          <w:sz w:val="22"/>
-          <w:szCs w:val="22"/>
-        </w:rPr>
-        <w:t>”</w:t>
-      </w:r>
-    </w:p>
-    <w:p>
-      <w:pPr>
-        <w:pStyle w:val="ListParagraph"/>
-        <w:numPr>
-          <w:ilvl w:val="1"/>
-          <w:numId w:val="1"/>
-        </w:numPr>
-        <w:rPr>
-          <w:rFonts w:ascii="Times New Roman" w:hAnsi="Times New Roman" w:cs="Times New Roman"/>
-          <w:sz w:val="22"/>
-          <w:szCs w:val="22"/>
-        </w:rPr>
-      </w:pPr>
-      <w:r>
-        <w:rPr>
-          <w:rFonts w:ascii="Times New Roman" w:hAnsi="Times New Roman" w:cs="Times New Roman"/>
-          <w:sz w:val="22"/>
-          <w:szCs w:val="22"/>
-        </w:rPr>
-        <w:t>Formatting: E.g. “AI-FORM-34”</w:t>
-      </w:r>
-    </w:p>
-    <w:p>
-      <w:pPr>
-        <w:pStyle w:val="ListParagraph"/>
-        <w:numPr>
-          <w:ilvl w:val="1"/>
-          <w:numId w:val="1"/>
-        </w:numPr>
-        <w:rPr>
-          <w:rFonts w:ascii="Times New Roman" w:hAnsi="Times New Roman" w:cs="Times New Roman"/>
-          <w:sz w:val="22"/>
-          <w:szCs w:val="22"/>
-        </w:rPr>
-      </w:pPr>
-      <w:r>
-        <w:rPr>
-          <w:rFonts w:ascii="Times New Roman" w:hAnsi="Times New Roman" w:cs="Times New Roman"/>
-          <w:sz w:val="22"/>
-          <w:szCs w:val="22"/>
-        </w:rPr>
-        <w:t>Idea Generation: E.g. “AI-IDEA</w:t>
-      </w:r>
-      <w:r>
-        <w:rPr>
-          <w:rFonts w:ascii="Times New Roman" w:hAnsi="Times New Roman" w:cs="Times New Roman"/>
-          <w:sz w:val="22"/>
-          <w:szCs w:val="22"/>
-        </w:rPr>
-        <w:t>-11”</w:t>
-      </w:r>
-    </w:p>
-    <w:p>
-      <w:pPr>
-        <w:pStyle w:val="ListParagraph"/>
-        <w:numPr>
-          <w:ilvl w:val="1"/>
-          <w:numId w:val="1"/>
-        </w:numPr>
-        <w:rPr>
-          <w:rFonts w:ascii="Times New Roman" w:hAnsi="Times New Roman" w:cs="Times New Roman"/>
-          <w:sz w:val="22"/>
-          <w:szCs w:val="22"/>
-        </w:rPr>
-      </w:pPr>
-      <w:r>
-        <w:rPr>
-          <w:rFonts w:ascii="Times New Roman" w:hAnsi="Times New Roman" w:cs="Times New Roman"/>
-          <w:sz w:val="22"/>
-          <w:szCs w:val="22"/>
-        </w:rPr>
-        <w:t>Coding: E.g. “AI-CODE-12”</w:t>
-      </w:r>
-    </w:p>
-    <w:p>
-      <w:pPr>
-        <w:pStyle w:val="ListParagraph"/>
-        <w:numPr>
-          <w:ilvl w:val="1"/>
-          <w:numId w:val="1"/>
-        </w:numPr>
-        <w:rPr>
-          <w:rFonts w:ascii="Times New Roman" w:hAnsi="Times New Roman" w:cs="Times New Roman"/>
-          <w:sz w:val="22"/>
-          <w:szCs w:val="22"/>
-        </w:rPr>
-      </w:pPr>
-      <w:r>
-        <w:rPr>
-          <w:rFonts w:ascii="Times New Roman" w:hAnsi="Times New Roman" w:cs="Times New Roman"/>
-          <w:sz w:val="22"/>
-          <w:szCs w:val="22"/>
-        </w:rPr>
-        <w:t>Analysis: E.g. “AI-ANA-55”</w:t>
-      </w:r>
-    </w:p>
-    <w:p>
-      <w:pPr>
-        <w:pStyle w:val="ListParagraph"/>
-        <w:numPr>
-          <w:ilvl w:val="1"/>
-          <w:numId w:val="1"/>
-        </w:numPr>
-        <w:rPr>
-          <w:rFonts w:ascii="Times New Roman" w:hAnsi="Times New Roman" w:cs="Times New Roman"/>
-          <w:sz w:val="22"/>
-          <w:szCs w:val="22"/>
-        </w:rPr>
-      </w:pPr>
-      <w:r>
-        <w:rPr>
-          <w:rFonts w:ascii="Times New Roman" w:hAnsi="Times New Roman" w:cs="Times New Roman"/>
-          <w:sz w:val="22"/>
-          <w:szCs w:val="22"/>
-        </w:rPr>
-        <w:t>Design: E.g.” AI-DES-91”</w:t>
-      </w:r>
-    </w:p>
-    <w:p>
-      <w:pPr>
-        <w:pStyle w:val="ListParagraph"/>
-        <w:numPr>
-          <w:ilvl w:val="1"/>
-          <w:numId w:val="1"/>
-        </w:numPr>
-        <w:rPr>
-          <w:rFonts w:ascii="Times New Roman" w:hAnsi="Times New Roman" w:cs="Times New Roman"/>
-          <w:sz w:val="22"/>
-          <w:szCs w:val="22"/>
-        </w:rPr>
-      </w:pPr>
-      <w:r>
-        <w:rPr>
-          <w:rFonts w:ascii="Times New Roman" w:hAnsi="Times New Roman" w:cs="Times New Roman"/>
-          <w:sz w:val="22"/>
-          <w:szCs w:val="22"/>
-        </w:rPr>
-        <w:t>Debug: E.g. “AI-DEB-83”</w:t>
-      </w:r>
-    </w:p>
-    <w:p>
-      <w:pPr>
-        <w:pStyle w:val="ListParagraph"/>
-        <w:numPr>
-          <w:ilvl w:val="1"/>
-          <w:numId w:val="1"/>
-        </w:numPr>
-        <w:rPr>
-          <w:rFonts w:ascii="Times New Roman" w:hAnsi="Times New Roman" w:cs="Times New Roman"/>
-          <w:sz w:val="22"/>
-          <w:szCs w:val="22"/>
-        </w:rPr>
-      </w:pPr>
-      <w:r>
-        <w:rPr>
-          <w:rFonts w:ascii="Times New Roman" w:hAnsi="Times New Roman" w:cs="Times New Roman"/>
-          <w:sz w:val="22"/>
-          <w:szCs w:val="22"/>
-        </w:rPr>
-        <w:t>Review documentation: E.g. “AI-REV-32”</w:t>
-      </w:r>
-    </w:p>
-    <w:p>
-      <w:pPr>
-        <w:pStyle w:val="ListParagraph"/>
-        <w:numPr>
-          <w:ilvl w:val="1"/>
-          <w:numId w:val="1"/>
-        </w:numPr>
-        <w:rPr>
-          <w:rFonts w:ascii="Times New Roman" w:hAnsi="Times New Roman" w:cs="Times New Roman"/>
-          <w:sz w:val="22"/>
-          <w:szCs w:val="22"/>
-        </w:rPr>
-      </w:pPr>
-      <w:r>
-        <w:rPr>
-          <w:rFonts w:ascii="Times New Roman" w:hAnsi="Times New Roman" w:cs="Times New Roman"/>
-          <w:sz w:val="22"/>
-          <w:szCs w:val="22"/>
-        </w:rPr>
-        <w:t>Test: E.g. “AI-TEST-2”</w:t>
-      </w:r>
-    </w:p>
-    <w:p>
-      <w:pPr>
-        <w:rPr>
-          <w:rFonts w:ascii="Times New Roman" w:hAnsi="Times New Roman" w:cs="Times New Roman"/>
-          <w:sz w:val="22"/>
-          <w:szCs w:val="22"/>
-        </w:rPr>
-      </w:pPr>
-      <w:r>
-        <w:rPr>
-          <w:rFonts w:ascii="Times New Roman" w:hAnsi="Times New Roman" w:cs="Times New Roman"/>
-          <w:sz w:val="22"/>
-          <w:szCs w:val="22"/>
-        </w:rPr>
-        <w:t>If</w:t>
-      </w:r>
-      <w:r>
-        <w:rPr>
-          <w:rFonts w:ascii="Times New Roman" w:hAnsi="Times New Roman" w:cs="Times New Roman"/>
-          <w:sz w:val="22"/>
-          <w:szCs w:val="22"/>
-        </w:rPr>
-        <w:t xml:space="preserve"> more ID naming standards are required</w:t>
-      </w:r>
-      <w:r>
-        <w:rPr>
-          <w:rFonts w:ascii="Times New Roman" w:hAnsi="Times New Roman" w:cs="Times New Roman"/>
-          <w:sz w:val="22"/>
-          <w:szCs w:val="22"/>
-        </w:rPr>
-        <w:t xml:space="preserve"> for more project variety tasks</w:t>
-      </w:r>
-      <w:r>
-        <w:rPr>
-          <w:rFonts w:ascii="Times New Roman" w:hAnsi="Times New Roman" w:cs="Times New Roman"/>
-          <w:sz w:val="22"/>
-          <w:szCs w:val="22"/>
-        </w:rPr>
-        <w:t xml:space="preserve">, inform lead of this so that more standards can be discussed and approved or rejected. These ones at the top are simply </w:t>
-      </w:r>
-      <w:r>
-        <w:rPr>
-          <w:rFonts w:ascii="Times New Roman" w:hAnsi="Times New Roman" w:cs="Times New Roman"/>
-          <w:sz w:val="22"/>
-          <w:szCs w:val="22"/>
-        </w:rPr>
-        <w:t>base AI ID naming conventions</w:t>
-      </w:r>
-      <w:r>
-        <w:rPr>
-          <w:rFonts w:ascii="Times New Roman" w:hAnsi="Times New Roman" w:cs="Times New Roman"/>
-          <w:sz w:val="22"/>
-          <w:szCs w:val="22"/>
-        </w:rPr>
-        <w:t xml:space="preserve"> for known project elements</w:t>
-      </w:r>
-      <w:r>
-        <w:rPr>
-          <w:rFonts w:ascii="Times New Roman" w:hAnsi="Times New Roman" w:cs="Times New Roman"/>
-          <w:sz w:val="22"/>
-          <w:szCs w:val="22"/>
-        </w:rPr>
-        <w:t>.</w:t>
-      </w:r>
-      <w:r>
-        <w:rPr>
-          <w:rFonts w:ascii="Times New Roman" w:hAnsi="Times New Roman" w:cs="Times New Roman"/>
-          <w:sz w:val="22"/>
-          <w:szCs w:val="22"/>
-        </w:rPr>
-        <w:t xml:space="preserve"> Also</w:t>
-      </w:r>
-      <w:r>
-        <w:rPr>
-          <w:rFonts w:ascii="Times New Roman" w:hAnsi="Times New Roman" w:cs="Times New Roman"/>
-          <w:sz w:val="22"/>
-          <w:szCs w:val="22"/>
-        </w:rPr>
-        <w:t xml:space="preserve">, if a person used AI for research for the first time, he/she will write </w:t>
-      </w:r>
-      <w:r>
-        <w:rPr>
-          <w:rFonts w:ascii="Times New Roman" w:hAnsi="Times New Roman" w:cs="Times New Roman"/>
-          <w:sz w:val="22"/>
-          <w:szCs w:val="22"/>
-        </w:rPr>
-        <w:t>“</w:t>
-      </w:r>
-      <w:r>
-        <w:rPr>
-          <w:rFonts w:ascii="Times New Roman" w:hAnsi="Times New Roman" w:cs="Times New Roman"/>
-          <w:sz w:val="22"/>
-          <w:szCs w:val="22"/>
-        </w:rPr>
-        <w:t>AI-RES-1</w:t>
-      </w:r>
-      <w:r>
-        <w:rPr>
-          <w:rFonts w:ascii="Times New Roman" w:hAnsi="Times New Roman" w:cs="Times New Roman"/>
-          <w:sz w:val="22"/>
-          <w:szCs w:val="22"/>
-        </w:rPr>
-        <w:t>”</w:t>
-      </w:r>
-      <w:r>
-        <w:rPr>
-          <w:rFonts w:ascii="Times New Roman" w:hAnsi="Times New Roman" w:cs="Times New Roman"/>
-          <w:sz w:val="22"/>
-          <w:szCs w:val="22"/>
-        </w:rPr>
-        <w:t xml:space="preserve"> but if </w:t>
-      </w:r>
-      <w:r>
-        <w:rPr>
-          <w:rFonts w:ascii="Times New Roman" w:hAnsi="Times New Roman" w:cs="Times New Roman"/>
-          <w:sz w:val="22"/>
-          <w:szCs w:val="22"/>
-        </w:rPr>
-        <w:t xml:space="preserve">he/she uses AI to debug code, do not increment the ID number, write </w:t>
-      </w:r>
-      <w:r>
-        <w:rPr>
-          <w:rFonts w:ascii="Times New Roman" w:hAnsi="Times New Roman" w:cs="Times New Roman"/>
-          <w:sz w:val="22"/>
-          <w:szCs w:val="22"/>
-        </w:rPr>
-        <w:t>“</w:t>
-      </w:r>
-      <w:r>
-        <w:rPr>
-          <w:rFonts w:ascii="Times New Roman" w:hAnsi="Times New Roman" w:cs="Times New Roman"/>
-          <w:sz w:val="22"/>
-          <w:szCs w:val="22"/>
-        </w:rPr>
-        <w:t>AI-</w:t>
-      </w:r>
-      <w:r>
-        <w:rPr>
-          <w:rFonts w:ascii="Times New Roman" w:hAnsi="Times New Roman" w:cs="Times New Roman"/>
-          <w:sz w:val="22"/>
-          <w:szCs w:val="22"/>
-        </w:rPr>
-        <w:t>DEB-1”. Only increment the ID number once the AI has assisted more than once in a specific usage such as research</w:t>
-      </w:r>
-      <w:r>
-        <w:rPr>
-          <w:rFonts w:ascii="Times New Roman" w:hAnsi="Times New Roman" w:cs="Times New Roman"/>
-          <w:sz w:val="22"/>
-          <w:szCs w:val="22"/>
-        </w:rPr>
-        <w:t xml:space="preserve"> and debug.</w:t>
-      </w:r>
-    </w:p>
-    <w:p>
-      <w:pPr>
-        <w:pStyle w:val="ListParagraph"/>
-        <w:numPr>
-          <w:ilvl w:val="0"/>
-          <w:numId w:val="1"/>
-        </w:numPr>
-        <w:rPr>
-          <w:rFonts w:ascii="Times New Roman" w:hAnsi="Times New Roman" w:cs="Times New Roman"/>
-          <w:sz w:val="22"/>
-          <w:szCs w:val="22"/>
-        </w:rPr>
-      </w:pPr>
-      <w:r>
-        <w:rPr>
-          <w:rFonts w:ascii="Times New Roman" w:hAnsi="Times New Roman" w:cs="Times New Roman"/>
+          <w:rFonts w:ascii="Times New Roman" w:eastAsia="Times New Roman" w:hAnsi="Times New Roman" w:cs="Times New Roman"/>
           <w:sz w:val="22"/>
           <w:szCs w:val="22"/>
         </w:rPr>
@@ -495,53 +103,22 @@
         <w:pStyle w:val="ListParagraph"/>
         <w:numPr>
           <w:ilvl w:val="0"/>
-          <w:numId w:val="1"/>
+          <w:numId w:val="3"/>
         </w:numPr>
+        <w:spacing w:after="0" w:line="276" w:lineRule="auto"/>
         <w:rPr>
-          <w:rFonts w:ascii="Times New Roman" w:hAnsi="Times New Roman" w:cs="Times New Roman"/>
+          <w:rFonts w:ascii="Times New Roman" w:eastAsia="Times New Roman" w:hAnsi="Times New Roman" w:cs="Times New Roman"/>
           <w:sz w:val="22"/>
           <w:szCs w:val="22"/>
         </w:rPr>
       </w:pPr>
       <w:r>
         <w:rPr>
-          <w:rFonts w:ascii="Times New Roman" w:hAnsi="Times New Roman" w:cs="Times New Roman"/>
+          <w:rFonts w:ascii="Times New Roman" w:eastAsia="Times New Roman" w:hAnsi="Times New Roman" w:cs="Times New Roman"/>
           <w:sz w:val="22"/>
           <w:szCs w:val="22"/>
         </w:rPr>
-        <w:t xml:space="preserve">Date: This is the date on which the team member acquired the usage of AI. For </w:t>
-      </w:r>
-      <w:r>
-        <w:rPr>
-          <w:rFonts w:ascii="Times New Roman" w:hAnsi="Times New Roman" w:cs="Times New Roman"/>
-          <w:sz w:val="22"/>
-          <w:szCs w:val="22"/>
-        </w:rPr>
-        <w:t>conciseness, keep the date format such as “25/</w:t>
-      </w:r>
-      <w:r>
-        <w:rPr>
-          <w:rFonts w:ascii="Times New Roman" w:hAnsi="Times New Roman" w:cs="Times New Roman"/>
-          <w:sz w:val="22"/>
-          <w:szCs w:val="22"/>
-        </w:rPr>
-        <w:t>06/2026</w:t>
-      </w:r>
-      <w:r>
-        <w:rPr>
-          <w:rFonts w:ascii="Times New Roman" w:hAnsi="Times New Roman" w:cs="Times New Roman"/>
-          <w:sz w:val="22"/>
-          <w:szCs w:val="22"/>
-        </w:rPr>
-        <w:t>”</w:t>
-      </w:r>
-      <w:r>
-        <w:rPr>
-          <w:rFonts w:ascii="Times New Roman" w:hAnsi="Times New Roman" w:cs="Times New Roman"/>
-          <w:sz w:val="22"/>
-          <w:szCs w:val="22"/>
-        </w:rPr>
-        <w:t>.</w:t>
+        <w:t>Date: This is the date on which the team member acquired the usage of AI. For conciseness, keep the date format such as “25/06/2026”.</w:t>
       </w:r>
     </w:p>
     <w:p>
@@ -549,37 +126,22 @@
         <w:pStyle w:val="ListParagraph"/>
         <w:numPr>
           <w:ilvl w:val="0"/>
-          <w:numId w:val="1"/>
+          <w:numId w:val="3"/>
         </w:numPr>
+        <w:spacing w:after="0" w:line="276" w:lineRule="auto"/>
         <w:rPr>
-          <w:rFonts w:ascii="Times New Roman" w:hAnsi="Times New Roman" w:cs="Times New Roman"/>
+          <w:rFonts w:ascii="Times New Roman" w:eastAsia="Times New Roman" w:hAnsi="Times New Roman" w:cs="Times New Roman"/>
           <w:sz w:val="22"/>
           <w:szCs w:val="22"/>
         </w:rPr>
       </w:pPr>
       <w:r>
         <w:rPr>
-          <w:rFonts w:ascii="Times New Roman" w:hAnsi="Times New Roman" w:cs="Times New Roman"/>
+          <w:rFonts w:ascii="Times New Roman" w:eastAsia="Times New Roman" w:hAnsi="Times New Roman" w:cs="Times New Roman"/>
           <w:sz w:val="22"/>
           <w:szCs w:val="22"/>
         </w:rPr>
-        <w:t xml:space="preserve">Tool: This is the tool that </w:t>
-      </w:r>
-      <w:r>
-        <w:rPr>
-          <w:rFonts w:ascii="Times New Roman" w:hAnsi="Times New Roman" w:cs="Times New Roman"/>
-          <w:sz w:val="22"/>
-          <w:szCs w:val="22"/>
-        </w:rPr>
-        <w:t xml:space="preserve">a team member </w:t>
-      </w:r>
-      <w:r>
-        <w:rPr>
-          <w:rFonts w:ascii="Times New Roman" w:hAnsi="Times New Roman" w:cs="Times New Roman"/>
-          <w:sz w:val="22"/>
-          <w:szCs w:val="22"/>
-        </w:rPr>
-        <w:t>used, in other words, name the AI tool. E.g. “Gemini”.</w:t>
+        <w:t>Tool: This is the tool that a team member used, in other words, name the AI tool. E.g. “Gemini”.</w:t>
       </w:r>
     </w:p>
     <w:p>
@@ -587,45 +149,22 @@
         <w:pStyle w:val="ListParagraph"/>
         <w:numPr>
           <w:ilvl w:val="0"/>
-          <w:numId w:val="1"/>
+          <w:numId w:val="3"/>
         </w:numPr>
+        <w:spacing w:after="0" w:line="276" w:lineRule="auto"/>
         <w:rPr>
-          <w:rFonts w:ascii="Times New Roman" w:hAnsi="Times New Roman" w:cs="Times New Roman"/>
+          <w:rFonts w:ascii="Times New Roman" w:eastAsia="Times New Roman" w:hAnsi="Times New Roman" w:cs="Times New Roman"/>
           <w:sz w:val="22"/>
           <w:szCs w:val="22"/>
         </w:rPr>
       </w:pPr>
       <w:r>
         <w:rPr>
-          <w:rFonts w:ascii="Times New Roman" w:hAnsi="Times New Roman" w:cs="Times New Roman"/>
+          <w:rFonts w:ascii="Times New Roman" w:eastAsia="Times New Roman" w:hAnsi="Times New Roman" w:cs="Times New Roman"/>
           <w:sz w:val="22"/>
           <w:szCs w:val="22"/>
         </w:rPr>
-        <w:t xml:space="preserve">Engineering Task: </w:t>
-      </w:r>
-      <w:r>
-        <w:rPr>
-          <w:rFonts w:ascii="Times New Roman" w:hAnsi="Times New Roman" w:cs="Times New Roman"/>
-          <w:sz w:val="22"/>
-          <w:szCs w:val="22"/>
-        </w:rPr>
-        <w:t xml:space="preserve">Team member must explain why they </w:t>
-      </w:r>
-      <w:r>
-        <w:rPr>
-          <w:rFonts w:ascii="Times New Roman" w:hAnsi="Times New Roman" w:cs="Times New Roman"/>
-          <w:sz w:val="22"/>
-          <w:szCs w:val="22"/>
-        </w:rPr>
-        <w:t xml:space="preserve">used the AI tool. </w:t>
-      </w:r>
-      <w:r>
-        <w:rPr>
-          <w:rFonts w:ascii="Times New Roman" w:hAnsi="Times New Roman" w:cs="Times New Roman"/>
-          <w:sz w:val="22"/>
-          <w:szCs w:val="22"/>
-        </w:rPr>
-        <w:t>How did it assist for the project?</w:t>
+        <w:t>Engineering Task: Team member must explain why they used the AI tool. How did it assist for the project?</w:t>
       </w:r>
     </w:p>
     <w:p>
@@ -633,37 +172,22 @@
         <w:pStyle w:val="ListParagraph"/>
         <w:numPr>
           <w:ilvl w:val="0"/>
-          <w:numId w:val="1"/>
+          <w:numId w:val="3"/>
         </w:numPr>
+        <w:spacing w:after="0" w:line="276" w:lineRule="auto"/>
         <w:rPr>
-          <w:rFonts w:ascii="Times New Roman" w:hAnsi="Times New Roman" w:cs="Times New Roman"/>
+          <w:rFonts w:ascii="Times New Roman" w:eastAsia="Times New Roman" w:hAnsi="Times New Roman" w:cs="Times New Roman"/>
           <w:sz w:val="22"/>
           <w:szCs w:val="22"/>
         </w:rPr>
       </w:pPr>
       <w:r>
         <w:rPr>
-          <w:rFonts w:ascii="Times New Roman" w:hAnsi="Times New Roman" w:cs="Times New Roman"/>
+          <w:rFonts w:ascii="Times New Roman" w:eastAsia="Times New Roman" w:hAnsi="Times New Roman" w:cs="Times New Roman"/>
           <w:sz w:val="22"/>
           <w:szCs w:val="22"/>
         </w:rPr>
-        <w:t xml:space="preserve">AI contribution: Write down what the AI contributed for the engineering task. Do not copy and paste the actual response from AI, simply summarize what the AI contributed for </w:t>
-      </w:r>
-      <w:r>
-        <w:rPr>
-          <w:rFonts w:ascii="Times New Roman" w:hAnsi="Times New Roman" w:cs="Times New Roman"/>
-          <w:sz w:val="22"/>
-          <w:szCs w:val="22"/>
-        </w:rPr>
-        <w:t>the</w:t>
-      </w:r>
-      <w:r>
-        <w:rPr>
-          <w:rFonts w:ascii="Times New Roman" w:hAnsi="Times New Roman" w:cs="Times New Roman"/>
-          <w:sz w:val="22"/>
-          <w:szCs w:val="22"/>
-        </w:rPr>
-        <w:t xml:space="preserve"> task.</w:t>
+        <w:t>AI contribution: Write down what the AI contributed for the engineering task. Do not copy and paste the actual response from AI, simply summarize what the AI contributed for the task.</w:t>
       </w:r>
     </w:p>
     <w:p>
@@ -671,53 +195,22 @@
         <w:pStyle w:val="ListParagraph"/>
         <w:numPr>
           <w:ilvl w:val="0"/>
-          <w:numId w:val="1"/>
+          <w:numId w:val="3"/>
         </w:numPr>
+        <w:spacing w:after="0" w:line="276" w:lineRule="auto"/>
         <w:rPr>
-          <w:rFonts w:ascii="Times New Roman" w:hAnsi="Times New Roman" w:cs="Times New Roman"/>
+          <w:rFonts w:ascii="Times New Roman" w:eastAsia="Times New Roman" w:hAnsi="Times New Roman" w:cs="Times New Roman"/>
           <w:sz w:val="22"/>
           <w:szCs w:val="22"/>
         </w:rPr>
       </w:pPr>
       <w:r>
         <w:rPr>
-          <w:rFonts w:ascii="Times New Roman" w:hAnsi="Times New Roman" w:cs="Times New Roman"/>
+          <w:rFonts w:ascii="Times New Roman" w:eastAsia="Times New Roman" w:hAnsi="Times New Roman" w:cs="Times New Roman"/>
           <w:sz w:val="22"/>
           <w:szCs w:val="22"/>
         </w:rPr>
-        <w:t xml:space="preserve">Verification: </w:t>
-      </w:r>
-      <w:r>
-        <w:rPr>
-          <w:rFonts w:ascii="Times New Roman" w:hAnsi="Times New Roman" w:cs="Times New Roman"/>
-          <w:sz w:val="22"/>
-          <w:szCs w:val="22"/>
-        </w:rPr>
-        <w:t>How did a team member</w:t>
-      </w:r>
-      <w:r>
-        <w:rPr>
-          <w:rFonts w:ascii="Times New Roman" w:hAnsi="Times New Roman" w:cs="Times New Roman"/>
-          <w:sz w:val="22"/>
-          <w:szCs w:val="22"/>
-        </w:rPr>
-        <w:t xml:space="preserve"> check that the AI’s claim or assistance is correct? E.g. If </w:t>
-      </w:r>
-      <w:r>
-        <w:rPr>
-          <w:rFonts w:ascii="Times New Roman" w:hAnsi="Times New Roman" w:cs="Times New Roman"/>
-          <w:sz w:val="22"/>
-          <w:szCs w:val="22"/>
-        </w:rPr>
-        <w:t xml:space="preserve">a team member asked AI to guide research, </w:t>
-      </w:r>
-      <w:r>
-        <w:rPr>
-          <w:rFonts w:ascii="Times New Roman" w:hAnsi="Times New Roman" w:cs="Times New Roman"/>
-          <w:sz w:val="22"/>
-          <w:szCs w:val="22"/>
-        </w:rPr>
-        <w:t>verify the AI’s claim by seeing if the resources recommended has not been fabricated and exists on Google Scholar.</w:t>
+        <w:t>Verification: How did a team member check that the AI’s claim or assistance is correct? E.g. If a team member asked AI to guide research, verify the AI’s claim by seeing if the resources recommended has not been fabricated and exists on Google Scholar.</w:t>
       </w:r>
     </w:p>
     <w:p>
@@ -725,53 +218,22 @@
         <w:pStyle w:val="ListParagraph"/>
         <w:numPr>
           <w:ilvl w:val="0"/>
-          <w:numId w:val="1"/>
+          <w:numId w:val="3"/>
         </w:numPr>
+        <w:spacing w:after="0" w:line="276" w:lineRule="auto"/>
         <w:rPr>
-          <w:rFonts w:ascii="Times New Roman" w:hAnsi="Times New Roman" w:cs="Times New Roman"/>
+          <w:rFonts w:ascii="Times New Roman" w:eastAsia="Times New Roman" w:hAnsi="Times New Roman" w:cs="Times New Roman"/>
           <w:sz w:val="22"/>
           <w:szCs w:val="22"/>
         </w:rPr>
       </w:pPr>
       <w:r>
         <w:rPr>
-          <w:rFonts w:ascii="Times New Roman" w:hAnsi="Times New Roman" w:cs="Times New Roman"/>
+          <w:rFonts w:ascii="Times New Roman" w:eastAsia="Times New Roman" w:hAnsi="Times New Roman" w:cs="Times New Roman"/>
           <w:sz w:val="22"/>
           <w:szCs w:val="22"/>
         </w:rPr>
-        <w:t xml:space="preserve">Decision: This is where a team member decides if they will accept the AI’s assistance or if they reject it. Simply write </w:t>
-      </w:r>
-      <w:r>
-        <w:rPr>
-          <w:rFonts w:ascii="Times New Roman" w:hAnsi="Times New Roman" w:cs="Times New Roman"/>
-          <w:sz w:val="22"/>
-          <w:szCs w:val="22"/>
-        </w:rPr>
-        <w:t>what was accepted</w:t>
-      </w:r>
-      <w:r>
-        <w:rPr>
-          <w:rFonts w:ascii="Times New Roman" w:hAnsi="Times New Roman" w:cs="Times New Roman"/>
-          <w:sz w:val="22"/>
-          <w:szCs w:val="22"/>
-        </w:rPr>
-        <w:t>, changed, or</w:t>
-      </w:r>
-      <w:r>
-        <w:rPr>
-          <w:rFonts w:ascii="Times New Roman" w:hAnsi="Times New Roman" w:cs="Times New Roman"/>
-          <w:sz w:val="22"/>
-          <w:szCs w:val="22"/>
-        </w:rPr>
-        <w:t xml:space="preserve"> rejected</w:t>
-      </w:r>
-      <w:r>
-        <w:rPr>
-          <w:rFonts w:ascii="Times New Roman" w:hAnsi="Times New Roman" w:cs="Times New Roman"/>
-          <w:sz w:val="22"/>
-          <w:szCs w:val="22"/>
-        </w:rPr>
-        <w:t xml:space="preserve"> from AI.</w:t>
+        <w:t>Decision: This is where a team member decides if they will accept the AI’s assistance or if they reject it. Simply write what was accepted, changed, or rejected from AI.</w:t>
       </w:r>
     </w:p>
     <w:p>
@@ -779,46 +241,21 @@
         <w:pStyle w:val="ListParagraph"/>
         <w:numPr>
           <w:ilvl w:val="0"/>
-          <w:numId w:val="1"/>
+          <w:numId w:val="3"/>
         </w:numPr>
+        <w:spacing w:after="0" w:line="276" w:lineRule="auto"/>
         <w:rPr>
           <w:rFonts w:ascii="Times New Roman" w:hAnsi="Times New Roman" w:cs="Times New Roman"/>
-          <w:sz w:val="22"/>
-          <w:szCs w:val="22"/>
         </w:rPr>
       </w:pPr>
       <w:r>
         <w:rPr>
-          <w:rFonts w:ascii="Times New Roman" w:hAnsi="Times New Roman" w:cs="Times New Roman"/>
+          <w:rFonts w:ascii="Times New Roman" w:eastAsia="Times New Roman" w:hAnsi="Times New Roman" w:cs="Times New Roman"/>
           <w:sz w:val="22"/>
           <w:szCs w:val="22"/>
         </w:rPr>
         <w:t>Issues Found: If AI did not contribute well and issues were found when a team member asked AI for assistance, write down what went wrong.</w:t>
       </w:r>
-    </w:p>
-    <w:p>
-      <w:pPr>
-        <w:ind w:left="360"/>
-        <w:rPr>
-          <w:rFonts w:ascii="Times New Roman" w:hAnsi="Times New Roman" w:cs="Times New Roman"/>
-        </w:rPr>
-      </w:pPr>
-    </w:p>
-    <w:p>
-      <w:pPr>
-        <w:pStyle w:val="ListParagraph"/>
-        <w:ind w:left="1440"/>
-        <w:rPr>
-          <w:rFonts w:ascii="Times New Roman" w:hAnsi="Times New Roman" w:cs="Times New Roman"/>
-        </w:rPr>
-      </w:pPr>
-    </w:p>
-    <w:p>
-      <w:pPr>
-        <w:rPr>
-          <w:rFonts w:ascii="Times New Roman" w:hAnsi="Times New Roman" w:cs="Times New Roman"/>
-        </w:rPr>
-      </w:pPr>
     </w:p>
     <w:tbl>
       <w:tblPr>
@@ -1241,7 +678,18 @@
                 <w:lang w:val="en-US"/>
                 <w14:ligatures w14:val="none"/>
               </w:rPr>
-              <w:t>AI-DEBUG-01 </w:t>
+              <w:t>AI-</w:t>
+            </w:r>
+            <w:r>
+              <w:rPr>
+                <w:rFonts w:ascii="Times New Roman" w:eastAsia="MS Mincho" w:hAnsi="Times New Roman" w:cs="Times New Roman"/>
+                <w:kern w:val="0"/>
+                <w:sz w:val="12"/>
+                <w:szCs w:val="12"/>
+                <w:lang w:val="en-US"/>
+                <w14:ligatures w14:val="none"/>
+              </w:rPr>
+              <w:t>001</w:t>
             </w:r>
           </w:p>
           <w:p>
@@ -1747,7 +1195,18 @@
                 <w:lang w:val="en-US"/>
                 <w14:ligatures w14:val="none"/>
               </w:rPr>
-              <w:t>AI-IDEA-01 </w:t>
+              <w:t>AI-</w:t>
+            </w:r>
+            <w:r>
+              <w:rPr>
+                <w:rFonts w:ascii="Times New Roman" w:eastAsia="MS Mincho" w:hAnsi="Times New Roman" w:cs="Times New Roman"/>
+                <w:kern w:val="0"/>
+                <w:sz w:val="12"/>
+                <w:szCs w:val="12"/>
+                <w:lang w:val="en-US"/>
+                <w14:ligatures w14:val="none"/>
+              </w:rPr>
+              <w:t>002</w:t>
             </w:r>
           </w:p>
           <w:p>
@@ -2150,31 +1609,7 @@
                 <w:lang w:val="en-US"/>
                 <w14:ligatures w14:val="none"/>
               </w:rPr>
-              <w:t>Accepted the naming convention but did not accept the word usage. Own words tailored to project </w:t>
-            </w:r>
-            <w:proofErr w:type="gramStart"/>
-            <w:r>
-              <w:rPr>
-                <w:rFonts w:ascii="Times New Roman" w:eastAsia="MS Mincho" w:hAnsi="Times New Roman" w:cs="Times New Roman"/>
-                <w:kern w:val="0"/>
-                <w:sz w:val="12"/>
-                <w:szCs w:val="12"/>
-                <w:lang w:val="en-US"/>
-                <w14:ligatures w14:val="none"/>
-              </w:rPr>
-              <w:t>was</w:t>
-            </w:r>
-            <w:proofErr w:type="gramEnd"/>
-            <w:r>
-              <w:rPr>
-                <w:rFonts w:ascii="Times New Roman" w:eastAsia="MS Mincho" w:hAnsi="Times New Roman" w:cs="Times New Roman"/>
-                <w:kern w:val="0"/>
-                <w:sz w:val="12"/>
-                <w:szCs w:val="12"/>
-                <w:lang w:val="en-US"/>
-                <w14:ligatures w14:val="none"/>
-              </w:rPr>
-              <w:t> used such as DEBUG, RES, and REV. </w:t>
+              <w:t>Accepted the naming convention but did not accept the word usage. Own words tailored to project was used such as DEBUG, RES, and REV. </w:t>
             </w:r>
           </w:p>
           <w:p>
@@ -2277,7 +1712,18 @@
                 <w:lang w:val="en-US"/>
                 <w14:ligatures w14:val="none"/>
               </w:rPr>
-              <w:t>AI-FORM-01 </w:t>
+              <w:t>AI-</w:t>
+            </w:r>
+            <w:r>
+              <w:rPr>
+                <w:rFonts w:ascii="Times New Roman" w:eastAsia="MS Mincho" w:hAnsi="Times New Roman" w:cs="Times New Roman"/>
+                <w:kern w:val="0"/>
+                <w:sz w:val="12"/>
+                <w:szCs w:val="12"/>
+                <w:lang w:val="en-US"/>
+                <w14:ligatures w14:val="none"/>
+              </w:rPr>
+              <w:t>003</w:t>
             </w:r>
           </w:p>
         </w:tc>
@@ -2615,7 +2061,18 @@
                 <w:lang w:val="en-US"/>
                 <w14:ligatures w14:val="none"/>
               </w:rPr>
-              <w:t>AI-RES-01 </w:t>
+              <w:t>AI-</w:t>
+            </w:r>
+            <w:r>
+              <w:rPr>
+                <w:rFonts w:ascii="Times New Roman" w:eastAsia="MS Mincho" w:hAnsi="Times New Roman" w:cs="Times New Roman"/>
+                <w:kern w:val="0"/>
+                <w:sz w:val="12"/>
+                <w:szCs w:val="12"/>
+                <w:lang w:val="en-US"/>
+                <w14:ligatures w14:val="none"/>
+              </w:rPr>
+              <w:t>004</w:t>
             </w:r>
           </w:p>
         </w:tc>
@@ -2861,31 +2318,7 @@
                 <w:lang w:val="en-US"/>
                 <w14:ligatures w14:val="none"/>
               </w:rPr>
-              <w:t xml:space="preserve">Link </w:t>
-            </w:r>
-            <w:proofErr w:type="gramStart"/>
-            <w:r>
-              <w:rPr>
-                <w:rFonts w:ascii="Times New Roman" w:eastAsia="MS Mincho" w:hAnsi="Times New Roman" w:cs="Times New Roman"/>
-                <w:kern w:val="0"/>
-                <w:sz w:val="12"/>
-                <w:szCs w:val="12"/>
-                <w:lang w:val="en-US"/>
-                <w14:ligatures w14:val="none"/>
-              </w:rPr>
-              <w:t>is provided</w:t>
-            </w:r>
-            <w:proofErr w:type="gramEnd"/>
-            <w:r>
-              <w:rPr>
-                <w:rFonts w:ascii="Times New Roman" w:eastAsia="MS Mincho" w:hAnsi="Times New Roman" w:cs="Times New Roman"/>
-                <w:kern w:val="0"/>
-                <w:sz w:val="12"/>
-                <w:szCs w:val="12"/>
-                <w:lang w:val="en-US"/>
-                <w14:ligatures w14:val="none"/>
-              </w:rPr>
-              <w:t xml:space="preserve"> and access works, Pacific Certifications is a real company. </w:t>
+              <w:t>Link is provided and access works, Pacific Certifications is a real company. </w:t>
             </w:r>
           </w:p>
         </w:tc>
@@ -2922,31 +2355,7 @@
                 <w:lang w:val="en-US"/>
                 <w14:ligatures w14:val="none"/>
               </w:rPr>
-              <w:t>Accept the pdf, </w:t>
-            </w:r>
-            <w:proofErr w:type="gramStart"/>
-            <w:r>
-              <w:rPr>
-                <w:rFonts w:ascii="Times New Roman" w:eastAsia="MS Mincho" w:hAnsi="Times New Roman" w:cs="Times New Roman"/>
-                <w:kern w:val="0"/>
-                <w:sz w:val="12"/>
-                <w:szCs w:val="12"/>
-                <w:lang w:val="en-US"/>
-                <w14:ligatures w14:val="none"/>
-              </w:rPr>
-              <w:t>used it</w:t>
-            </w:r>
-            <w:proofErr w:type="gramEnd"/>
-            <w:r>
-              <w:rPr>
-                <w:rFonts w:ascii="Times New Roman" w:eastAsia="MS Mincho" w:hAnsi="Times New Roman" w:cs="Times New Roman"/>
-                <w:kern w:val="0"/>
-                <w:sz w:val="12"/>
-                <w:szCs w:val="12"/>
-                <w:lang w:val="en-US"/>
-                <w14:ligatures w14:val="none"/>
-              </w:rPr>
-              <w:t> for usability, availability, portability, error prevention, and security for non-functional requirements.  </w:t>
+              <w:t>Accept the pdf, used it for usability, availability, portability, error prevention, and security for non-functional requirements.  </w:t>
             </w:r>
           </w:p>
         </w:tc>
@@ -3025,7 +2434,18 @@
                 <w:lang w:val="en-US"/>
                 <w14:ligatures w14:val="none"/>
               </w:rPr>
-              <w:t>AI-RES-02 </w:t>
+              <w:t>AI-</w:t>
+            </w:r>
+            <w:r>
+              <w:rPr>
+                <w:rFonts w:ascii="Times New Roman" w:eastAsia="MS Mincho" w:hAnsi="Times New Roman" w:cs="Times New Roman"/>
+                <w:kern w:val="0"/>
+                <w:sz w:val="12"/>
+                <w:szCs w:val="12"/>
+                <w:lang w:val="en-US"/>
+                <w14:ligatures w14:val="none"/>
+              </w:rPr>
+              <w:t>005</w:t>
             </w:r>
           </w:p>
         </w:tc>
@@ -3363,7 +2783,29 @@
                 <w:lang w:val="en-US"/>
                 <w14:ligatures w14:val="none"/>
               </w:rPr>
-              <w:t>AI-ANA-01 </w:t>
+              <w:t>AI-</w:t>
+            </w:r>
+            <w:r>
+              <w:rPr>
+                <w:rFonts w:ascii="Times New Roman" w:eastAsia="MS Mincho" w:hAnsi="Times New Roman" w:cs="Times New Roman"/>
+                <w:kern w:val="0"/>
+                <w:sz w:val="12"/>
+                <w:szCs w:val="12"/>
+                <w:lang w:val="en-US"/>
+                <w14:ligatures w14:val="none"/>
+              </w:rPr>
+              <w:t>006</w:t>
+            </w:r>
+            <w:r>
+              <w:rPr>
+                <w:rFonts w:ascii="Times New Roman" w:eastAsia="MS Mincho" w:hAnsi="Times New Roman" w:cs="Times New Roman"/>
+                <w:kern w:val="0"/>
+                <w:sz w:val="12"/>
+                <w:szCs w:val="12"/>
+                <w:lang w:val="en-US"/>
+                <w14:ligatures w14:val="none"/>
+              </w:rPr>
+              <w:t> </w:t>
             </w:r>
           </w:p>
         </w:tc>
@@ -3701,7 +3143,18 @@
                 <w:lang w:val="en-US"/>
                 <w14:ligatures w14:val="none"/>
               </w:rPr>
-              <w:t>AI-RES-03 </w:t>
+              <w:t>AI-</w:t>
+            </w:r>
+            <w:r>
+              <w:rPr>
+                <w:rFonts w:ascii="Times New Roman" w:eastAsia="MS Mincho" w:hAnsi="Times New Roman" w:cs="Times New Roman"/>
+                <w:kern w:val="0"/>
+                <w:sz w:val="12"/>
+                <w:szCs w:val="12"/>
+                <w:lang w:val="en-US"/>
+                <w14:ligatures w14:val="none"/>
+              </w:rPr>
+              <w:t>007</w:t>
             </w:r>
           </w:p>
         </w:tc>
@@ -4039,7 +3492,18 @@
                 <w:lang w:val="en-US"/>
                 <w14:ligatures w14:val="none"/>
               </w:rPr>
-              <w:t>AI-REV-01 </w:t>
+              <w:t>AI-</w:t>
+            </w:r>
+            <w:r>
+              <w:rPr>
+                <w:rFonts w:ascii="Times New Roman" w:eastAsia="MS Mincho" w:hAnsi="Times New Roman" w:cs="Times New Roman"/>
+                <w:kern w:val="0"/>
+                <w:sz w:val="12"/>
+                <w:szCs w:val="12"/>
+                <w:lang w:val="en-US"/>
+                <w14:ligatures w14:val="none"/>
+              </w:rPr>
+              <w:t>008</w:t>
             </w:r>
           </w:p>
         </w:tc>
@@ -4298,55 +3762,7 @@
                 <w:lang w:val="en-US"/>
                 <w14:ligatures w14:val="none"/>
               </w:rPr>
-              <w:t>Accept sections that </w:t>
-            </w:r>
-            <w:proofErr w:type="gramStart"/>
-            <w:r>
-              <w:rPr>
-                <w:rFonts w:ascii="Times New Roman" w:eastAsia="MS Mincho" w:hAnsi="Times New Roman" w:cs="Times New Roman"/>
-                <w:kern w:val="0"/>
-                <w:sz w:val="12"/>
-                <w:szCs w:val="12"/>
-                <w:lang w:val="en-US"/>
-                <w14:ligatures w14:val="none"/>
-              </w:rPr>
-              <w:t>has</w:t>
-            </w:r>
-            <w:proofErr w:type="gramEnd"/>
-            <w:r>
-              <w:rPr>
-                <w:rFonts w:ascii="Times New Roman" w:eastAsia="MS Mincho" w:hAnsi="Times New Roman" w:cs="Times New Roman"/>
-                <w:kern w:val="0"/>
-                <w:sz w:val="12"/>
-                <w:szCs w:val="12"/>
-                <w:lang w:val="en-US"/>
-                <w14:ligatures w14:val="none"/>
-              </w:rPr>
-              <w:t xml:space="preserve"> answers </w:t>
-            </w:r>
-            <w:proofErr w:type="gramStart"/>
-            <w:r>
-              <w:rPr>
-                <w:rFonts w:ascii="Times New Roman" w:eastAsia="MS Mincho" w:hAnsi="Times New Roman" w:cs="Times New Roman"/>
-                <w:kern w:val="0"/>
-                <w:sz w:val="12"/>
-                <w:szCs w:val="12"/>
-                <w:lang w:val="en-US"/>
-                <w14:ligatures w14:val="none"/>
-              </w:rPr>
-              <w:t>and used</w:t>
-            </w:r>
-            <w:proofErr w:type="gramEnd"/>
-            <w:r>
-              <w:rPr>
-                <w:rFonts w:ascii="Times New Roman" w:eastAsia="MS Mincho" w:hAnsi="Times New Roman" w:cs="Times New Roman"/>
-                <w:kern w:val="0"/>
-                <w:sz w:val="12"/>
-                <w:szCs w:val="12"/>
-                <w:lang w:val="en-US"/>
-                <w14:ligatures w14:val="none"/>
-              </w:rPr>
-              <w:t xml:space="preserve"> own words to explain the risks of ignoring the forward engineering considerations. </w:t>
+              <w:t>Accept sections that has answers and used own words to explain the risks of ignoring the forward engineering considerations. </w:t>
             </w:r>
           </w:p>
         </w:tc>
@@ -4425,7 +3841,18 @@
                 <w:lang w:val="en-US"/>
                 <w14:ligatures w14:val="none"/>
               </w:rPr>
-              <w:t>AI-FORM-02 </w:t>
+              <w:t>AI-</w:t>
+            </w:r>
+            <w:r>
+              <w:rPr>
+                <w:rFonts w:ascii="Times New Roman" w:eastAsia="MS Mincho" w:hAnsi="Times New Roman" w:cs="Times New Roman"/>
+                <w:kern w:val="0"/>
+                <w:sz w:val="12"/>
+                <w:szCs w:val="12"/>
+                <w:lang w:val="en-US"/>
+                <w14:ligatures w14:val="none"/>
+              </w:rPr>
+              <w:t>009</w:t>
             </w:r>
           </w:p>
         </w:tc>
@@ -4763,7 +4190,18 @@
                 <w:lang w:val="en-US"/>
                 <w14:ligatures w14:val="none"/>
               </w:rPr>
-              <w:t>AI-RES-04 </w:t>
+              <w:t>AI-</w:t>
+            </w:r>
+            <w:r>
+              <w:rPr>
+                <w:rFonts w:ascii="Times New Roman" w:eastAsia="MS Mincho" w:hAnsi="Times New Roman" w:cs="Times New Roman"/>
+                <w:kern w:val="0"/>
+                <w:sz w:val="12"/>
+                <w:szCs w:val="12"/>
+                <w:lang w:val="en-US"/>
+                <w14:ligatures w14:val="none"/>
+              </w:rPr>
+              <w:t>010</w:t>
             </w:r>
           </w:p>
         </w:tc>
@@ -5101,7 +4539,18 @@
                 <w:lang w:val="en-US"/>
                 <w14:ligatures w14:val="none"/>
               </w:rPr>
-              <w:t>AI-REV-02 </w:t>
+              <w:t>AI-</w:t>
+            </w:r>
+            <w:r>
+              <w:rPr>
+                <w:rFonts w:ascii="Times New Roman" w:eastAsia="MS Mincho" w:hAnsi="Times New Roman" w:cs="Times New Roman"/>
+                <w:kern w:val="0"/>
+                <w:sz w:val="12"/>
+                <w:szCs w:val="12"/>
+                <w:lang w:val="en-US"/>
+                <w14:ligatures w14:val="none"/>
+              </w:rPr>
+              <w:t>011</w:t>
             </w:r>
           </w:p>
         </w:tc>
@@ -5478,7 +4927,18 @@
                 <w:lang w:val="en-US"/>
                 <w14:ligatures w14:val="none"/>
               </w:rPr>
-              <w:t>AI-REV-03 </w:t>
+              <w:t>AI-</w:t>
+            </w:r>
+            <w:r>
+              <w:rPr>
+                <w:rFonts w:ascii="Times New Roman" w:eastAsia="MS Mincho" w:hAnsi="Times New Roman" w:cs="Times New Roman"/>
+                <w:kern w:val="0"/>
+                <w:sz w:val="12"/>
+                <w:szCs w:val="12"/>
+                <w:lang w:val="en-US"/>
+                <w14:ligatures w14:val="none"/>
+              </w:rPr>
+              <w:t>012</w:t>
             </w:r>
           </w:p>
         </w:tc>
@@ -5912,7 +5372,18 @@
                 <w:lang w:val="en-US"/>
                 <w14:ligatures w14:val="none"/>
               </w:rPr>
-              <w:t>AI-REV-04 </w:t>
+              <w:t>AI-</w:t>
+            </w:r>
+            <w:r>
+              <w:rPr>
+                <w:rFonts w:ascii="Times New Roman" w:eastAsia="MS Mincho" w:hAnsi="Times New Roman" w:cs="Times New Roman"/>
+                <w:kern w:val="0"/>
+                <w:sz w:val="12"/>
+                <w:szCs w:val="12"/>
+                <w:lang w:val="en-US"/>
+                <w14:ligatures w14:val="none"/>
+              </w:rPr>
+              <w:t>013</w:t>
             </w:r>
           </w:p>
         </w:tc>
@@ -6298,7 +5769,18 @@
                 <w:lang w:val="en-US"/>
                 <w14:ligatures w14:val="none"/>
               </w:rPr>
-              <w:t>AI-RES-05</w:t>
+              <w:t>AI-</w:t>
+            </w:r>
+            <w:r>
+              <w:rPr>
+                <w:rFonts w:ascii="Times New Roman" w:eastAsia="MS Mincho" w:hAnsi="Times New Roman" w:cs="Times New Roman"/>
+                <w:kern w:val="0"/>
+                <w:sz w:val="12"/>
+                <w:szCs w:val="12"/>
+                <w:lang w:val="en-US"/>
+                <w14:ligatures w14:val="none"/>
+              </w:rPr>
+              <w:t>014</w:t>
             </w:r>
           </w:p>
         </w:tc>
@@ -6636,7 +6118,18 @@
                 <w:lang w:val="en-US"/>
                 <w14:ligatures w14:val="none"/>
               </w:rPr>
-              <w:t>AI-FORM-03</w:t>
+              <w:t>AI-</w:t>
+            </w:r>
+            <w:r>
+              <w:rPr>
+                <w:rFonts w:ascii="Times New Roman" w:eastAsia="MS Mincho" w:hAnsi="Times New Roman" w:cs="Times New Roman"/>
+                <w:kern w:val="0"/>
+                <w:sz w:val="12"/>
+                <w:szCs w:val="12"/>
+                <w:lang w:val="en-US"/>
+                <w14:ligatures w14:val="none"/>
+              </w:rPr>
+              <w:t>015</w:t>
             </w:r>
           </w:p>
         </w:tc>
@@ -6910,6 +6403,346 @@
             </w:tcBorders>
             <w:shd w:val="clear" w:color="auto" w:fill="FFFFFF"/>
             <w:hideMark/>
+          </w:tcPr>
+          <w:p>
+            <w:pPr>
+              <w:spacing w:after="120" w:line="264" w:lineRule="auto"/>
+              <w:rPr>
+                <w:rFonts w:ascii="Times New Roman" w:eastAsia="MS Mincho" w:hAnsi="Times New Roman" w:cs="Times New Roman"/>
+                <w:kern w:val="0"/>
+                <w:sz w:val="12"/>
+                <w:szCs w:val="12"/>
+                <w:lang w:val="en-US"/>
+                <w14:ligatures w14:val="none"/>
+              </w:rPr>
+            </w:pPr>
+            <w:r>
+              <w:rPr>
+                <w:rFonts w:ascii="Times New Roman" w:eastAsia="MS Mincho" w:hAnsi="Times New Roman" w:cs="Times New Roman"/>
+                <w:kern w:val="0"/>
+                <w:sz w:val="12"/>
+                <w:szCs w:val="12"/>
+                <w:lang w:val="en-US"/>
+                <w14:ligatures w14:val="none"/>
+              </w:rPr>
+              <w:t>None</w:t>
+            </w:r>
+          </w:p>
+        </w:tc>
+      </w:tr>
+      <w:tr>
+        <w:trPr>
+          <w:trHeight w:val="300"/>
+        </w:trPr>
+        <w:tc>
+          <w:tcPr>
+            <w:tcW w:w="469" w:type="dxa"/>
+            <w:tcBorders>
+              <w:top w:val="single" w:sz="6" w:space="0" w:color="auto"/>
+              <w:left w:val="single" w:sz="6" w:space="0" w:color="auto"/>
+              <w:bottom w:val="single" w:sz="6" w:space="0" w:color="auto"/>
+              <w:right w:val="single" w:sz="6" w:space="0" w:color="auto"/>
+            </w:tcBorders>
+            <w:shd w:val="clear" w:color="auto" w:fill="FFFFFF"/>
+          </w:tcPr>
+          <w:p>
+            <w:pPr>
+              <w:spacing w:after="120" w:line="264" w:lineRule="auto"/>
+              <w:rPr>
+                <w:rFonts w:ascii="Times New Roman" w:eastAsia="MS Mincho" w:hAnsi="Times New Roman" w:cs="Times New Roman"/>
+                <w:kern w:val="0"/>
+                <w:sz w:val="12"/>
+                <w:szCs w:val="12"/>
+                <w:lang w:val="en-US"/>
+                <w14:ligatures w14:val="none"/>
+              </w:rPr>
+            </w:pPr>
+            <w:r>
+              <w:rPr>
+                <w:rFonts w:ascii="Times New Roman" w:eastAsia="MS Mincho" w:hAnsi="Times New Roman" w:cs="Times New Roman"/>
+                <w:kern w:val="0"/>
+                <w:sz w:val="12"/>
+                <w:szCs w:val="12"/>
+                <w:lang w:val="en-US"/>
+                <w14:ligatures w14:val="none"/>
+              </w:rPr>
+              <w:t>AI-016</w:t>
+            </w:r>
+          </w:p>
+        </w:tc>
+        <w:tc>
+          <w:tcPr>
+            <w:tcW w:w="1192" w:type="dxa"/>
+            <w:tcBorders>
+              <w:top w:val="single" w:sz="6" w:space="0" w:color="auto"/>
+              <w:left w:val="single" w:sz="6" w:space="0" w:color="auto"/>
+              <w:bottom w:val="single" w:sz="6" w:space="0" w:color="auto"/>
+              <w:right w:val="single" w:sz="6" w:space="0" w:color="auto"/>
+            </w:tcBorders>
+            <w:shd w:val="clear" w:color="auto" w:fill="FFFFFF"/>
+          </w:tcPr>
+          <w:p>
+            <w:pPr>
+              <w:spacing w:after="120" w:line="264" w:lineRule="auto"/>
+              <w:rPr>
+                <w:rFonts w:ascii="Times New Roman" w:eastAsia="MS Mincho" w:hAnsi="Times New Roman" w:cs="Times New Roman"/>
+                <w:kern w:val="0"/>
+                <w:sz w:val="12"/>
+                <w:szCs w:val="12"/>
+                <w:lang w:val="en-US"/>
+                <w14:ligatures w14:val="none"/>
+              </w:rPr>
+            </w:pPr>
+            <w:r>
+              <w:rPr>
+                <w:rFonts w:ascii="Times New Roman" w:eastAsia="MS Mincho" w:hAnsi="Times New Roman" w:cs="Times New Roman"/>
+                <w:kern w:val="0"/>
+                <w:sz w:val="12"/>
+                <w:szCs w:val="12"/>
+                <w:lang w:val="en-US"/>
+                <w14:ligatures w14:val="none"/>
+              </w:rPr>
+              <w:t>Benno Weideman</w:t>
+            </w:r>
+          </w:p>
+        </w:tc>
+        <w:tc>
+          <w:tcPr>
+            <w:tcW w:w="592" w:type="dxa"/>
+            <w:tcBorders>
+              <w:top w:val="single" w:sz="6" w:space="0" w:color="auto"/>
+              <w:left w:val="single" w:sz="6" w:space="0" w:color="auto"/>
+              <w:bottom w:val="single" w:sz="6" w:space="0" w:color="auto"/>
+              <w:right w:val="single" w:sz="6" w:space="0" w:color="auto"/>
+            </w:tcBorders>
+            <w:shd w:val="clear" w:color="auto" w:fill="FFFFFF"/>
+          </w:tcPr>
+          <w:p>
+            <w:pPr>
+              <w:spacing w:after="120" w:line="264" w:lineRule="auto"/>
+              <w:rPr>
+                <w:rFonts w:ascii="Times New Roman" w:eastAsia="MS Mincho" w:hAnsi="Times New Roman" w:cs="Times New Roman"/>
+                <w:kern w:val="0"/>
+                <w:sz w:val="12"/>
+                <w:szCs w:val="12"/>
+                <w:lang w:val="en-US"/>
+                <w14:ligatures w14:val="none"/>
+              </w:rPr>
+            </w:pPr>
+            <w:r>
+              <w:rPr>
+                <w:rFonts w:ascii="Times New Roman" w:eastAsia="MS Mincho" w:hAnsi="Times New Roman" w:cs="Times New Roman"/>
+                <w:kern w:val="0"/>
+                <w:sz w:val="12"/>
+                <w:szCs w:val="12"/>
+                <w:lang w:val="en-US"/>
+                <w14:ligatures w14:val="none"/>
+              </w:rPr>
+              <w:t>14/09/2026</w:t>
+            </w:r>
+          </w:p>
+        </w:tc>
+        <w:tc>
+          <w:tcPr>
+            <w:tcW w:w="499" w:type="dxa"/>
+            <w:tcBorders>
+              <w:top w:val="single" w:sz="6" w:space="0" w:color="auto"/>
+              <w:left w:val="single" w:sz="6" w:space="0" w:color="auto"/>
+              <w:bottom w:val="single" w:sz="6" w:space="0" w:color="auto"/>
+              <w:right w:val="single" w:sz="6" w:space="0" w:color="auto"/>
+            </w:tcBorders>
+            <w:shd w:val="clear" w:color="auto" w:fill="FFFFFF"/>
+          </w:tcPr>
+          <w:p>
+            <w:pPr>
+              <w:spacing w:after="120" w:line="264" w:lineRule="auto"/>
+              <w:rPr>
+                <w:rFonts w:ascii="Times New Roman" w:eastAsia="MS Mincho" w:hAnsi="Times New Roman" w:cs="Times New Roman"/>
+                <w:kern w:val="0"/>
+                <w:sz w:val="12"/>
+                <w:szCs w:val="12"/>
+                <w:lang w:val="en-US"/>
+                <w14:ligatures w14:val="none"/>
+              </w:rPr>
+            </w:pPr>
+            <w:r>
+              <w:rPr>
+                <w:rFonts w:ascii="Times New Roman" w:eastAsia="MS Mincho" w:hAnsi="Times New Roman" w:cs="Times New Roman"/>
+                <w:kern w:val="0"/>
+                <w:sz w:val="12"/>
+                <w:szCs w:val="12"/>
+                <w:lang w:val="en-US"/>
+                <w14:ligatures w14:val="none"/>
+              </w:rPr>
+              <w:t>Claude</w:t>
+            </w:r>
+          </w:p>
+        </w:tc>
+        <w:tc>
+          <w:tcPr>
+            <w:tcW w:w="1731" w:type="dxa"/>
+            <w:tcBorders>
+              <w:top w:val="single" w:sz="6" w:space="0" w:color="auto"/>
+              <w:left w:val="single" w:sz="6" w:space="0" w:color="auto"/>
+              <w:bottom w:val="single" w:sz="6" w:space="0" w:color="auto"/>
+              <w:right w:val="single" w:sz="6" w:space="0" w:color="auto"/>
+            </w:tcBorders>
+            <w:shd w:val="clear" w:color="auto" w:fill="FFFFFF"/>
+          </w:tcPr>
+          <w:p>
+            <w:pPr>
+              <w:spacing w:after="120" w:line="264" w:lineRule="auto"/>
+              <w:rPr>
+                <w:rFonts w:ascii="Times New Roman" w:eastAsia="MS Mincho" w:hAnsi="Times New Roman" w:cs="Times New Roman"/>
+                <w:kern w:val="0"/>
+                <w:sz w:val="12"/>
+                <w:szCs w:val="12"/>
+                <w:lang w:val="en-US"/>
+                <w14:ligatures w14:val="none"/>
+              </w:rPr>
+            </w:pPr>
+            <w:r>
+              <w:rPr>
+                <w:rFonts w:ascii="Times New Roman" w:eastAsia="MS Mincho" w:hAnsi="Times New Roman" w:cs="Times New Roman"/>
+                <w:kern w:val="0"/>
+                <w:sz w:val="12"/>
+                <w:szCs w:val="12"/>
+                <w:lang w:val="en-US"/>
+                <w14:ligatures w14:val="none"/>
+              </w:rPr>
+              <w:t>Asked for generating code on how to set up the PostgreSQL database connection to the initial front-end and back-end</w:t>
+            </w:r>
+          </w:p>
+        </w:tc>
+        <w:tc>
+          <w:tcPr>
+            <w:tcW w:w="1838" w:type="dxa"/>
+            <w:tcBorders>
+              <w:top w:val="single" w:sz="6" w:space="0" w:color="auto"/>
+              <w:left w:val="single" w:sz="6" w:space="0" w:color="auto"/>
+              <w:bottom w:val="single" w:sz="6" w:space="0" w:color="auto"/>
+              <w:right w:val="single" w:sz="6" w:space="0" w:color="auto"/>
+            </w:tcBorders>
+            <w:shd w:val="clear" w:color="auto" w:fill="FFFFFF"/>
+          </w:tcPr>
+          <w:p>
+            <w:pPr>
+              <w:spacing w:after="120" w:line="264" w:lineRule="auto"/>
+              <w:rPr>
+                <w:rFonts w:ascii="Times New Roman" w:eastAsia="MS Mincho" w:hAnsi="Times New Roman" w:cs="Times New Roman"/>
+                <w:kern w:val="0"/>
+                <w:sz w:val="12"/>
+                <w:szCs w:val="12"/>
+                <w:lang w:val="en-US"/>
+                <w14:ligatures w14:val="none"/>
+              </w:rPr>
+            </w:pPr>
+            <w:r>
+              <w:rPr>
+                <w:rFonts w:ascii="Times New Roman" w:eastAsia="MS Mincho" w:hAnsi="Times New Roman" w:cs="Times New Roman"/>
+                <w:kern w:val="0"/>
+                <w:sz w:val="12"/>
+                <w:szCs w:val="12"/>
+                <w:lang w:val="en-US"/>
+                <w14:ligatures w14:val="none"/>
+              </w:rPr>
+              <w:t>Provided database connection code and fixes and missing implementations in the backend.</w:t>
+            </w:r>
+          </w:p>
+        </w:tc>
+        <w:tc>
+          <w:tcPr>
+            <w:tcW w:w="1335" w:type="dxa"/>
+            <w:tcBorders>
+              <w:top w:val="single" w:sz="6" w:space="0" w:color="auto"/>
+              <w:left w:val="single" w:sz="6" w:space="0" w:color="auto"/>
+              <w:bottom w:val="single" w:sz="6" w:space="0" w:color="auto"/>
+              <w:right w:val="single" w:sz="6" w:space="0" w:color="auto"/>
+            </w:tcBorders>
+            <w:shd w:val="clear" w:color="auto" w:fill="FFFFFF"/>
+          </w:tcPr>
+          <w:p>
+            <w:pPr>
+              <w:spacing w:after="120" w:line="264" w:lineRule="auto"/>
+              <w:rPr>
+                <w:rFonts w:ascii="Times New Roman" w:eastAsia="MS Mincho" w:hAnsi="Times New Roman" w:cs="Times New Roman"/>
+                <w:kern w:val="0"/>
+                <w:sz w:val="12"/>
+                <w:szCs w:val="12"/>
+                <w:lang w:val="en-US"/>
+                <w14:ligatures w14:val="none"/>
+              </w:rPr>
+            </w:pPr>
+            <w:r>
+              <w:rPr>
+                <w:rFonts w:ascii="Times New Roman" w:eastAsia="MS Mincho" w:hAnsi="Times New Roman" w:cs="Times New Roman"/>
+                <w:kern w:val="0"/>
+                <w:sz w:val="12"/>
+                <w:szCs w:val="12"/>
+                <w:lang w:val="en-US"/>
+                <w14:ligatures w14:val="none"/>
+              </w:rPr>
+              <w:t xml:space="preserve">Despite the </w:t>
+            </w:r>
+            <w:r>
+              <w:rPr>
+                <w:rFonts w:ascii="Times New Roman" w:eastAsia="MS Mincho" w:hAnsi="Times New Roman" w:cs="Times New Roman"/>
+                <w:kern w:val="0"/>
+                <w:sz w:val="12"/>
+                <w:szCs w:val="12"/>
+                <w:lang w:val="en-US"/>
+                <w14:ligatures w14:val="none"/>
+              </w:rPr>
+              <w:t>website that works, there must still be testing, verification, and changes done to ensure it is aligned with the project.</w:t>
+            </w:r>
+          </w:p>
+        </w:tc>
+        <w:tc>
+          <w:tcPr>
+            <w:tcW w:w="1428" w:type="dxa"/>
+            <w:tcBorders>
+              <w:top w:val="single" w:sz="6" w:space="0" w:color="auto"/>
+              <w:left w:val="single" w:sz="6" w:space="0" w:color="auto"/>
+              <w:bottom w:val="single" w:sz="6" w:space="0" w:color="auto"/>
+              <w:right w:val="single" w:sz="6" w:space="0" w:color="auto"/>
+            </w:tcBorders>
+            <w:shd w:val="clear" w:color="auto" w:fill="FFFFFF"/>
+          </w:tcPr>
+          <w:p>
+            <w:pPr>
+              <w:spacing w:after="120" w:line="264" w:lineRule="auto"/>
+              <w:rPr>
+                <w:rFonts w:ascii="Times New Roman" w:eastAsia="MS Mincho" w:hAnsi="Times New Roman" w:cs="Times New Roman"/>
+                <w:kern w:val="0"/>
+                <w:sz w:val="12"/>
+                <w:szCs w:val="12"/>
+                <w:lang w:val="en-US"/>
+                <w14:ligatures w14:val="none"/>
+              </w:rPr>
+            </w:pPr>
+            <w:r>
+              <w:rPr>
+                <w:rFonts w:ascii="Times New Roman" w:eastAsia="MS Mincho" w:hAnsi="Times New Roman" w:cs="Times New Roman"/>
+                <w:kern w:val="0"/>
+                <w:sz w:val="12"/>
+                <w:szCs w:val="12"/>
+                <w:lang w:val="en-US"/>
+                <w14:ligatures w14:val="none"/>
+              </w:rPr>
+              <w:t>Make changes to the code and website structure given by AI as milestone 2 progress but do not accept all work without verification.</w:t>
+            </w:r>
+          </w:p>
+        </w:tc>
+        <w:tc>
+          <w:tcPr>
+            <w:tcW w:w="1215" w:type="dxa"/>
+            <w:tcBorders>
+              <w:top w:val="single" w:sz="6" w:space="0" w:color="auto"/>
+              <w:left w:val="single" w:sz="6" w:space="0" w:color="auto"/>
+              <w:bottom w:val="single" w:sz="6" w:space="0" w:color="auto"/>
+              <w:right w:val="single" w:sz="6" w:space="0" w:color="auto"/>
+            </w:tcBorders>
+            <w:shd w:val="clear" w:color="auto" w:fill="FFFFFF"/>
           </w:tcPr>
           <w:p>
             <w:pPr>
@@ -7002,6 +6835,7 @@
             <w:id w:val="-573587230"/>
             <w:bibliography/>
           </w:sdtPr>
+          <w:sdtEndPr/>
           <w:sdtContent>
             <w:p>
               <w:pPr>
@@ -7361,11 +7195,100 @@
       </w:rPr>
     </w:lvl>
   </w:abstractNum>
+  <w:abstractNum w:abstractNumId="2" w15:restartNumberingAfterBreak="0">
+    <w:nsid w:val="704531DD"/>
+    <w:multiLevelType w:val="hybridMultilevel"/>
+    <w:tmpl w:val="9BB4D79A"/>
+    <w:lvl w:ilvl="0" w:tplc="EA7AF612">
+      <w:start w:val="1"/>
+      <w:numFmt w:val="decimal"/>
+      <w:lvlText w:val="%1."/>
+      <w:lvlJc w:val="left"/>
+      <w:pPr>
+        <w:ind w:left="720" w:hanging="360"/>
+      </w:pPr>
+    </w:lvl>
+    <w:lvl w:ilvl="1" w:tplc="B54CD63E">
+      <w:start w:val="1"/>
+      <w:numFmt w:val="lowerLetter"/>
+      <w:lvlText w:val="%2."/>
+      <w:lvlJc w:val="left"/>
+      <w:pPr>
+        <w:ind w:left="1440" w:hanging="360"/>
+      </w:pPr>
+    </w:lvl>
+    <w:lvl w:ilvl="2" w:tplc="B854260A">
+      <w:start w:val="1"/>
+      <w:numFmt w:val="lowerRoman"/>
+      <w:lvlText w:val="%3."/>
+      <w:lvlJc w:val="right"/>
+      <w:pPr>
+        <w:ind w:left="2160" w:hanging="180"/>
+      </w:pPr>
+    </w:lvl>
+    <w:lvl w:ilvl="3" w:tplc="D21619B8">
+      <w:start w:val="1"/>
+      <w:numFmt w:val="decimal"/>
+      <w:lvlText w:val="%4."/>
+      <w:lvlJc w:val="left"/>
+      <w:pPr>
+        <w:ind w:left="2880" w:hanging="360"/>
+      </w:pPr>
+    </w:lvl>
+    <w:lvl w:ilvl="4" w:tplc="03201B90">
+      <w:start w:val="1"/>
+      <w:numFmt w:val="lowerLetter"/>
+      <w:lvlText w:val="%5."/>
+      <w:lvlJc w:val="left"/>
+      <w:pPr>
+        <w:ind w:left="3600" w:hanging="360"/>
+      </w:pPr>
+    </w:lvl>
+    <w:lvl w:ilvl="5" w:tplc="DF66CF08">
+      <w:start w:val="1"/>
+      <w:numFmt w:val="lowerRoman"/>
+      <w:lvlText w:val="%6."/>
+      <w:lvlJc w:val="right"/>
+      <w:pPr>
+        <w:ind w:left="4320" w:hanging="180"/>
+      </w:pPr>
+    </w:lvl>
+    <w:lvl w:ilvl="6" w:tplc="15C8010C">
+      <w:start w:val="1"/>
+      <w:numFmt w:val="decimal"/>
+      <w:lvlText w:val="%7."/>
+      <w:lvlJc w:val="left"/>
+      <w:pPr>
+        <w:ind w:left="5040" w:hanging="360"/>
+      </w:pPr>
+    </w:lvl>
+    <w:lvl w:ilvl="7" w:tplc="927AD7E0">
+      <w:start w:val="1"/>
+      <w:numFmt w:val="lowerLetter"/>
+      <w:lvlText w:val="%8."/>
+      <w:lvlJc w:val="left"/>
+      <w:pPr>
+        <w:ind w:left="5760" w:hanging="360"/>
+      </w:pPr>
+    </w:lvl>
+    <w:lvl w:ilvl="8" w:tplc="3506AE14">
+      <w:start w:val="1"/>
+      <w:numFmt w:val="lowerRoman"/>
+      <w:lvlText w:val="%9."/>
+      <w:lvlJc w:val="right"/>
+      <w:pPr>
+        <w:ind w:left="6480" w:hanging="180"/>
+      </w:pPr>
+    </w:lvl>
+  </w:abstractNum>
   <w:num w:numId="1" w16cid:durableId="1092162233">
     <w:abstractNumId w:val="0"/>
   </w:num>
   <w:num w:numId="2" w16cid:durableId="455217585">
     <w:abstractNumId w:val="1"/>
+  </w:num>
+  <w:num w:numId="3" w16cid:durableId="849181720">
+    <w:abstractNumId w:val="2"/>
   </w:num>
 </w:numbering>
 </file>
@@ -7972,6 +7895,7 @@
   <w:style w:type="character" w:default="1" w:styleId="DefaultParagraphFont">
     <w:name w:val="Default Paragraph Font"/>
     <w:uiPriority w:val="1"/>
+    <w:semiHidden/>
     <w:unhideWhenUsed/>
   </w:style>
   <w:style w:type="table" w:default="1" w:styleId="TableNormal">

</xml_diff>